<commit_message>
tilføj prompts til kø
</commit_message>
<xml_diff>
--- a/Forbedringer til prompts.docx
+++ b/Forbedringer til prompts.docx
@@ -1,6 +1,6 @@
 
 <file path=word/document.xml><?xml version="1.0" encoding="utf-8"?>
-<w:document xmlns:wpc="http://schemas.microsoft.com/office/word/2010/wordprocessingCanvas" xmlns:cx="http://schemas.microsoft.com/office/drawing/2014/chartex" xmlns:cx1="http://schemas.microsoft.com/office/drawing/2015/9/8/chartex" xmlns:cx2="http://schemas.microsoft.com/office/drawing/2015/10/21/chartex" xmlns:cx3="http://schemas.microsoft.com/office/drawing/2016/5/9/chartex" xmlns:cx4="http://schemas.microsoft.com/office/drawing/2016/5/10/chartex" xmlns:cx5="http://schemas.microsoft.com/office/drawing/2016/5/11/chartex" xmlns:cx6="http://schemas.microsoft.com/office/drawing/2016/5/12/chartex" xmlns:cx7="http://schemas.microsoft.com/office/drawing/2016/5/13/chartex" xmlns:cx8="http://schemas.microsoft.com/office/drawing/2016/5/14/chartex" xmlns:mc="http://schemas.openxmlformats.org/markup-compatibility/2006" xmlns:aink="http://schemas.microsoft.com/office/drawing/2016/ink" xmlns:am3d="http://schemas.microsoft.com/office/drawing/2017/model3d" xmlns:o="urn:schemas-microsoft-com:office:office" xmlns:oel="http://schemas.microsoft.com/office/2019/extlst" xmlns:r="http://schemas.openxmlformats.org/officeDocument/2006/relationships" xmlns:m="http://schemas.openxmlformats.org/officeDocument/2006/math" xmlns:v="urn:schemas-microsoft-com:vml" xmlns:wp14="http://schemas.microsoft.com/office/word/2010/wordprocessingDrawing" xmlns:wp="http://schemas.openxmlformats.org/drawingml/2006/wordprocessingDrawing" xmlns:w10="urn:schemas-microsoft-com:office:word" xmlns:w="http://schemas.openxmlformats.org/wordprocessingml/2006/main" xmlns:w14="http://schemas.microsoft.com/office/word/2010/wordml" xmlns:w15="http://schemas.microsoft.com/office/word/2012/wordml" xmlns:w16cex="http://schemas.microsoft.com/office/word/2018/wordml/cex" xmlns:w16cid="http://schemas.microsoft.com/office/word/2016/wordml/cid" xmlns:w16="http://schemas.microsoft.com/office/word/2018/wordml" xmlns:w16du="http://schemas.microsoft.com/office/word/2023/wordml/word16du" xmlns:w16sdtdh="http://schemas.microsoft.com/office/word/2020/wordml/sdtdatahash" xmlns:w16sdtfl="http://schemas.microsoft.com/office/word/2024/wordml/sdtformatlock" xmlns:w16se="http://schemas.microsoft.com/office/word/2015/wordml/symex" xmlns:wpg="http://schemas.microsoft.com/office/word/2010/wordprocessingGroup" xmlns:wpi="http://schemas.microsoft.com/office/word/2010/wordprocessingInk" xmlns:wne="http://schemas.microsoft.com/office/word/2006/wordml" xmlns:wps="http://schemas.microsoft.com/office/word/2010/wordprocessingShape" mc:Ignorable="w14 w15 w16se w16cid w16 w16cex w16sdtdh w16sdtfl w16du wp14">
+<w:document xmlns:wpc="http://schemas.microsoft.com/office/word/2010/wordprocessingCanvas" xmlns:cx="http://schemas.microsoft.com/office/drawing/2014/chartex" xmlns:cx1="http://schemas.microsoft.com/office/drawing/2015/9/8/chartex" xmlns:cx2="http://schemas.microsoft.com/office/drawing/2015/10/21/chartex" xmlns:cx3="http://schemas.microsoft.com/office/drawing/2016/5/9/chartex" xmlns:cx4="http://schemas.microsoft.com/office/drawing/2016/5/10/chartex" xmlns:cx5="http://schemas.microsoft.com/office/drawing/2016/5/11/chartex" xmlns:cx6="http://schemas.microsoft.com/office/drawing/2016/5/12/chartex" xmlns:cx7="http://schemas.microsoft.com/office/drawing/2016/5/13/chartex" xmlns:cx8="http://schemas.microsoft.com/office/drawing/2016/5/14/chartex" xmlns:mc="http://schemas.openxmlformats.org/markup-compatibility/2006" xmlns:aink="http://schemas.microsoft.com/office/drawing/2016/ink" xmlns:am3d="http://schemas.microsoft.com/office/drawing/2017/model3d" xmlns:o="urn:schemas-microsoft-com:office:office" xmlns:oel="http://schemas.microsoft.com/office/2019/extlst" xmlns:r="http://schemas.openxmlformats.org/officeDocument/2006/relationships" xmlns:m="http://schemas.openxmlformats.org/officeDocument/2006/math" xmlns:v="urn:schemas-microsoft-com:vml" xmlns:wp14="http://schemas.microsoft.com/office/word/2010/wordprocessingDrawing" xmlns:wp="http://schemas.openxmlformats.org/drawingml/2006/wordprocessingDrawing" xmlns:w10="urn:schemas-microsoft-com:office:word" xmlns:w="http://schemas.openxmlformats.org/wordprocessingml/2006/main" xmlns:w14="http://schemas.microsoft.com/office/word/2010/wordml" xmlns:w15="http://schemas.microsoft.com/office/word/2012/wordml" xmlns:w16cei="http://schemas.microsoft.com/office/word/2026/wordml/cei" xmlns:w16cex="http://schemas.microsoft.com/office/word/2018/wordml/cex" xmlns:w16cid="http://schemas.microsoft.com/office/word/2016/wordml/cid" xmlns:w16="http://schemas.microsoft.com/office/word/2018/wordml" xmlns:w16du="http://schemas.microsoft.com/office/word/2023/wordml/word16du" xmlns:w16sdtdh="http://schemas.microsoft.com/office/word/2020/wordml/sdtdatahash" xmlns:w16sdtfl="http://schemas.microsoft.com/office/word/2024/wordml/sdtformatlock" xmlns:w16se="http://schemas.microsoft.com/office/word/2015/wordml/symex" xmlns:wpg="http://schemas.microsoft.com/office/word/2010/wordprocessingGroup" xmlns:wpi="http://schemas.microsoft.com/office/word/2010/wordprocessingInk" xmlns:wne="http://schemas.microsoft.com/office/word/2006/wordml" xmlns:wps="http://schemas.microsoft.com/office/word/2010/wordprocessingShape" mc:Ignorable="w14 w15 w16se w16cid w16 w16cex w16sdtdh w16sdtfl w16du wp14">
   <w:body>
     <w:p>
       <w:r>
@@ -63,21 +63,7 @@
         <w:rPr>
           <w:highlight w:val="green"/>
         </w:rPr>
-        <w:t>Kan du lave et eksempel hvor der holdes flere pauser på en dag</w:t>
-      </w:r>
-      <w:proofErr w:type="gramStart"/>
-      <w:r>
-        <w:rPr>
-          <w:highlight w:val="green"/>
-        </w:rPr>
-        <w:t>.</w:t>
-      </w:r>
-      <w:proofErr w:type="gramEnd"/>
-      <w:r>
-        <w:rPr>
-          <w:highlight w:val="green"/>
-        </w:rPr>
-        <w:t xml:space="preserve"> En på 6 minutter, en på 3 minutter og en længere på 27 minutter.</w:t>
+        <w:t>Kan du lave et eksempel hvor der holdes flere pauser på en dag. En på 6 minutter, en på 3 minutter og en længere på 27 minutter.</w:t>
       </w:r>
     </w:p>
     <w:p/>
@@ -86,21 +72,7 @@
         <w:rPr>
           <w:highlight w:val="green"/>
         </w:rPr>
-        <w:t xml:space="preserve">Vælger du at tilføje en aktivitet og du vælger, ferie, afspadsering, skole mm. Så skal du fjerne ”tur nummer” og pålæsning/aflæsning, så der kun er det relevante data input som mulighed. Og når man vælger </w:t>
-      </w:r>
-      <w:proofErr w:type="gramStart"/>
-      <w:r>
-        <w:rPr>
-          <w:highlight w:val="green"/>
-        </w:rPr>
-        <w:t>ferie</w:t>
-      </w:r>
-      <w:proofErr w:type="gramEnd"/>
-      <w:r>
-        <w:rPr>
-          <w:highlight w:val="green"/>
-        </w:rPr>
-        <w:t xml:space="preserve"> skal det tælle som hele dage, så de skal som standard være udfyldt for en hel arbejdsdag i deres normaltimer</w:t>
+        <w:t>Vælger du at tilføje en aktivitet og du vælger, ferie, afspadsering, skole mm. Så skal du fjerne ”tur nummer” og pålæsning/aflæsning, så der kun er det relevante data input som mulighed. Og når man vælger ferie skal det tælle som hele dage, så de skal som standard være udfyldt for en hel arbejdsdag i deres normaltimer</w:t>
       </w:r>
     </w:p>
     <w:p/>
@@ -114,7 +86,6 @@
     </w:p>
     <w:p/>
     <w:p>
-      <w:proofErr w:type="gramStart"/>
       <w:r>
         <w:rPr>
           <w:highlight w:val="green"/>
@@ -129,7 +100,6 @@
         <w:t>ddd</w:t>
       </w:r>
       <w:proofErr w:type="spellEnd"/>
-      <w:proofErr w:type="gramEnd"/>
       <w:r>
         <w:rPr>
           <w:highlight w:val="green"/>
@@ -366,21 +336,7 @@
         <w:rPr>
           <w:highlight w:val="green"/>
         </w:rPr>
-        <w:t>Ift. Symbolerne på vagter under 4 timer eller over 12 timer. Når status er ”godkendt</w:t>
-      </w:r>
-      <w:proofErr w:type="gramStart"/>
-      <w:r>
-        <w:rPr>
-          <w:highlight w:val="green"/>
-        </w:rPr>
-        <w:t>”</w:t>
-      </w:r>
-      <w:proofErr w:type="gramEnd"/>
-      <w:r>
-        <w:rPr>
-          <w:highlight w:val="green"/>
-        </w:rPr>
-        <w:t xml:space="preserve"> skal symbolerne fjernes. Hvis aktiviteterne åbnes igen, </w:t>
+        <w:t xml:space="preserve">Ift. Symbolerne på vagter under 4 timer eller over 12 timer. Når status er ”godkendt” skal symbolerne fjernes. Hvis aktiviteterne åbnes igen, </w:t>
       </w:r>
       <w:r>
         <w:rPr>
@@ -451,14 +407,7 @@
         <w:rPr>
           <w:highlight w:val="green"/>
         </w:rPr>
-        <w:t xml:space="preserve">Når du </w:t>
-      </w:r>
-      <w:proofErr w:type="gramStart"/>
-      <w:r>
-        <w:rPr>
-          <w:highlight w:val="green"/>
-        </w:rPr>
-        <w:t>importere</w:t>
+        <w:t>Når du importere</w:t>
       </w:r>
       <w:r>
         <w:rPr>
@@ -480,7 +429,6 @@
         <w:t>ddd</w:t>
       </w:r>
       <w:proofErr w:type="spellEnd"/>
-      <w:proofErr w:type="gramEnd"/>
       <w:r>
         <w:rPr>
           <w:highlight w:val="green"/>
@@ -514,14 +462,27 @@
         <w:rPr>
           <w:highlight w:val="yellow"/>
         </w:rPr>
-        <w:t xml:space="preserve">På hver aktivitet påføres turnummeret </w:t>
-      </w:r>
-      <w:proofErr w:type="gramStart"/>
+        <w:t>På hver aktivitet påføres turnummeret fra .</w:t>
+      </w:r>
+      <w:proofErr w:type="spellStart"/>
       <w:r>
         <w:rPr>
           <w:highlight w:val="yellow"/>
         </w:rPr>
-        <w:t>fra .</w:t>
+        <w:t>ddd</w:t>
+      </w:r>
+      <w:proofErr w:type="spellEnd"/>
+      <w:r>
+        <w:rPr>
+          <w:highlight w:val="yellow"/>
+        </w:rPr>
+        <w:t>-filen.</w:t>
+      </w:r>
+      <w:r>
+        <w:rPr>
+          <w:highlight w:val="yellow"/>
+        </w:rPr>
+        <w:t xml:space="preserve"> Det betyder, at du fra .</w:t>
       </w:r>
       <w:proofErr w:type="spellStart"/>
       <w:r>
@@ -531,75 +492,38 @@
         <w:t>ddd</w:t>
       </w:r>
       <w:proofErr w:type="spellEnd"/>
-      <w:proofErr w:type="gramEnd"/>
       <w:r>
         <w:rPr>
           <w:highlight w:val="yellow"/>
         </w:rPr>
-        <w:t>-filen.</w:t>
-      </w:r>
-      <w:r>
-        <w:rPr>
-          <w:highlight w:val="yellow"/>
-        </w:rPr>
-        <w:t xml:space="preserve"> Det betyder, at du </w:t>
-      </w:r>
-      <w:proofErr w:type="gramStart"/>
-      <w:r>
-        <w:rPr>
-          <w:highlight w:val="yellow"/>
-        </w:rPr>
-        <w:t>fra .</w:t>
+        <w:t>-filen skal indlæse turnummeret og påføre det hver aktivitet under ”Turnummer”.</w:t>
+      </w:r>
+      <w:r>
+        <w:t xml:space="preserve"> </w:t>
+      </w:r>
+      <w:r>
+        <w:sym w:font="Wingdings" w:char="F0E0"/>
+      </w:r>
+      <w:r>
+        <w:t xml:space="preserve"> standby kunne ikke findes i filen. Kræver flere filer og eksempler måske.</w:t>
+      </w:r>
+    </w:p>
+    <w:p>
+      <w:r>
+        <w:rPr>
+          <w:highlight w:val="green"/>
+        </w:rPr>
+        <w:lastRenderedPageBreak/>
+        <w:t>For hver aktivitet, skal du hente information fra .</w:t>
       </w:r>
       <w:proofErr w:type="spellStart"/>
       <w:r>
         <w:rPr>
-          <w:highlight w:val="yellow"/>
+          <w:highlight w:val="green"/>
         </w:rPr>
         <w:t>ddd</w:t>
       </w:r>
       <w:proofErr w:type="spellEnd"/>
-      <w:proofErr w:type="gramEnd"/>
-      <w:r>
-        <w:rPr>
-          <w:highlight w:val="yellow"/>
-        </w:rPr>
-        <w:t>-filen skal indlæse turnummeret og påføre det hver aktivitet under ”Turnummer”.</w:t>
-      </w:r>
-      <w:r>
-        <w:t xml:space="preserve"> </w:t>
-      </w:r>
-      <w:r>
-        <w:sym w:font="Wingdings" w:char="F0E0"/>
-      </w:r>
-      <w:r>
-        <w:t xml:space="preserve"> standby kunne ikke findes i filen. Kræver flere filer og eksempler måske.</w:t>
-      </w:r>
-    </w:p>
-    <w:p>
-      <w:r>
-        <w:rPr>
-          <w:highlight w:val="green"/>
-        </w:rPr>
-        <w:lastRenderedPageBreak/>
-        <w:t xml:space="preserve">For hver aktivitet, skal du hente information </w:t>
-      </w:r>
-      <w:proofErr w:type="gramStart"/>
-      <w:r>
-        <w:rPr>
-          <w:highlight w:val="green"/>
-        </w:rPr>
-        <w:t>fra .</w:t>
-      </w:r>
-      <w:proofErr w:type="spellStart"/>
-      <w:r>
-        <w:rPr>
-          <w:highlight w:val="green"/>
-        </w:rPr>
-        <w:t>ddd</w:t>
-      </w:r>
-      <w:proofErr w:type="spellEnd"/>
-      <w:proofErr w:type="gramEnd"/>
       <w:r>
         <w:rPr>
           <w:highlight w:val="green"/>
@@ -1343,21 +1267,7 @@
         <w:rPr>
           <w:highlight w:val="green"/>
         </w:rPr>
-        <w:t xml:space="preserve"> samt </w:t>
-      </w:r>
-      <w:proofErr w:type="gramStart"/>
-      <w:r>
-        <w:rPr>
-          <w:highlight w:val="green"/>
-        </w:rPr>
-        <w:t>total beløb</w:t>
-      </w:r>
-      <w:proofErr w:type="gramEnd"/>
-      <w:r>
-        <w:rPr>
-          <w:highlight w:val="green"/>
-        </w:rPr>
-        <w:t xml:space="preserve"> = antal x sats.</w:t>
+        <w:t xml:space="preserve"> samt total beløb = antal x sats.</w:t>
       </w:r>
     </w:p>
     <w:p>
@@ -1420,21 +1330,7 @@
         <w:rPr>
           <w:highlight w:val="green"/>
         </w:rPr>
-        <w:t xml:space="preserve"> skal hedde ”pause 1”, ”pause 2” osv. Det, der registreres </w:t>
-      </w:r>
-      <w:proofErr w:type="gramStart"/>
-      <w:r>
-        <w:rPr>
-          <w:highlight w:val="green"/>
-        </w:rPr>
-        <w:t>her</w:t>
-      </w:r>
-      <w:proofErr w:type="gramEnd"/>
-      <w:r>
-        <w:rPr>
-          <w:highlight w:val="green"/>
-        </w:rPr>
-        <w:t xml:space="preserve"> er de tidspunkter, som pauserne er afholdt </w:t>
+        <w:t xml:space="preserve"> skal hedde ”pause 1”, ”pause 2” osv. Det, der registreres her er de tidspunkter, som pauserne er afholdt </w:t>
       </w:r>
       <w:proofErr w:type="spellStart"/>
       <w:r>
@@ -1460,6 +1356,58 @@
         <w:t xml:space="preserve"> </w:t>
       </w:r>
     </w:p>
+    <w:p>
+      <w:r>
+        <w:rPr>
+          <w:highlight w:val="green"/>
+        </w:rPr>
+        <w:t>Når man opretter en manuel aktivitet og ikke tilføjer pause, skal man ved genåbning af aktiviteten kunne tilføje pause.</w:t>
+      </w:r>
+    </w:p>
+    <w:p>
+      <w:r>
+        <w:t>Man skal kunne rette i fraværsperioder (start og slutdato).</w:t>
+      </w:r>
+    </w:p>
+    <w:p>
+      <w:r>
+        <w:t>Ved overnatning skal der ikke ske en autoudfyldning af vognnummer.</w:t>
+      </w:r>
+    </w:p>
+    <w:p>
+      <w:r>
+        <w:t>Når man downloader en fraværsoversigt per medarbejder, skal der tilføjes en kolonne med</w:t>
+      </w:r>
+      <w:r>
+        <w:t xml:space="preserve"> datoen for afholdelses af fraværet.</w:t>
+      </w:r>
+    </w:p>
+    <w:p>
+      <w:r>
+        <w:t>Under lønkørsel fanen, skal der i tabellerne tilføjes en kolonne mellem Antal (timer i decimal) og ”sats”.</w:t>
+      </w:r>
+      <w:r>
+        <w:t xml:space="preserve"> Den tilføjede fane skal hedde ”Antal (tt.mm)” Her skal den vise antal tt.mm (timer og minutter) som den pågældende dag har</w:t>
+      </w:r>
+      <w:r>
+        <w:t xml:space="preserve"> – ligesom den anden antal-kolonne (som bare viser i decimaltal). Der skal også vises en total.</w:t>
+      </w:r>
+    </w:p>
+    <w:p>
+      <w:r>
+        <w:t xml:space="preserve">Når en aktivitet </w:t>
+      </w:r>
+      <w:r>
+        <w:t>splittes,</w:t>
+      </w:r>
+      <w:r>
+        <w:t xml:space="preserve"> skal den originalen vagt ikke vises i aktivitetsoversigten – kun de to dele af vagten, Hvis en af delene yderligere splittes, skal </w:t>
+      </w:r>
+      <w:r>
+        <w:t xml:space="preserve">den originale igen ikke vises men kun de to dele, der kommer ud af splittet osv. </w:t>
+      </w:r>
+    </w:p>
+    <w:p/>
     <w:p/>
     <w:p/>
     <w:sectPr>

</xml_diff>

<commit_message>
fraværsoversigt eksport viser nu dato.
</commit_message>
<xml_diff>
--- a/Forbedringer til prompts.docx
+++ b/Forbedringer til prompts.docx
@@ -1471,7 +1471,7 @@
     <w:p>
       <w:r>
         <w:rPr>
-          <w:highlight w:val="yellow"/>
+          <w:highlight w:val="green"/>
         </w:rPr>
         <w:t>Man skal kunne rette i fraværsperioder (start og slutdato).</w:t>
       </w:r>
@@ -1479,16 +1479,22 @@
     <w:p>
       <w:r>
         <w:rPr>
-          <w:highlight w:val="yellow"/>
+          <w:highlight w:val="green"/>
         </w:rPr>
         <w:t>Ved overnatning skal der ikke ske en autoudfyldning af vognnummer.</w:t>
       </w:r>
     </w:p>
     <w:p>
       <w:r>
+        <w:rPr>
+          <w:highlight w:val="green"/>
+        </w:rPr>
         <w:t>Når man downloader en fraværsoversigt per medarbejder, skal der tilføjes en kolonne med</w:t>
       </w:r>
       <w:r>
+        <w:rPr>
+          <w:highlight w:val="green"/>
+        </w:rPr>
         <w:t xml:space="preserve"> datoen for afholdelses af fraværet.</w:t>
       </w:r>
     </w:p>

</xml_diff>

<commit_message>
timer vises nu i tt:mm i lønkørsel, prøvekørsel, timesedler. timesedler har normal tid = timer arbejdet
</commit_message>
<xml_diff>
--- a/Forbedringer til prompts.docx
+++ b/Forbedringer til prompts.docx
@@ -1500,12 +1500,21 @@
     </w:p>
     <w:p>
       <w:r>
+        <w:rPr>
+          <w:highlight w:val="green"/>
+        </w:rPr>
         <w:t>Under lønkørsel fanen, skal der i tabellerne tilføjes en kolonne mellem Antal (timer i decimal) og ”sats”.</w:t>
       </w:r>
       <w:r>
+        <w:rPr>
+          <w:highlight w:val="green"/>
+        </w:rPr>
         <w:t xml:space="preserve"> Den tilføjede fane skal hedde ”Antal (tt.mm)” Her skal den vise antal tt.mm (timer og minutter) som den pågældende dag har</w:t>
       </w:r>
       <w:r>
+        <w:rPr>
+          <w:highlight w:val="green"/>
+        </w:rPr>
         <w:t xml:space="preserve"> – ligesom den anden antal-kolonne (som bare viser i decimaltal). Der skal også vises en total.</w:t>
       </w:r>
     </w:p>

</xml_diff>

<commit_message>
"fravær i morgen"-knap under vagtplan vælger nu næstkommende hverdag.
</commit_message>
<xml_diff>
--- a/Forbedringer til prompts.docx
+++ b/Forbedringer til prompts.docx
@@ -1534,9 +1534,15 @@
     </w:p>
     <w:p>
       <w:r>
+        <w:rPr>
+          <w:highlight w:val="yellow"/>
+        </w:rPr>
         <w:t xml:space="preserve">Under fanen ”Vagtplan”: ved klik på knappen ”Fravær i morgen” skal denne vælge den næstkommende hverdag. Det betyder, at </w:t>
       </w:r>
       <w:r>
+        <w:rPr>
+          <w:highlight w:val="yellow"/>
+        </w:rPr>
         <w:t>hvis man en fredag klikker på knappen, skal den hvis fravær for mandagen efter.</w:t>
       </w:r>
     </w:p>

</xml_diff>

<commit_message>
opdaterede dokumeneter, s kun fungerende funktioner er beskrevet
</commit_message>
<xml_diff>
--- a/Forbedringer til prompts.docx
+++ b/Forbedringer til prompts.docx
@@ -1521,25 +1521,25 @@
     <w:p>
       <w:r>
         <w:rPr>
-          <w:highlight w:val="yellow"/>
+          <w:highlight w:val="green"/>
         </w:rPr>
         <w:t xml:space="preserve">Når en aktivitet </w:t>
       </w:r>
       <w:r>
         <w:rPr>
-          <w:highlight w:val="yellow"/>
+          <w:highlight w:val="green"/>
         </w:rPr>
         <w:t>splittes,</w:t>
       </w:r>
       <w:r>
         <w:rPr>
-          <w:highlight w:val="yellow"/>
+          <w:highlight w:val="green"/>
         </w:rPr>
         <w:t xml:space="preserve"> skal den originalen vagt ikke vises i aktivitetsoversigten – kun de to dele af vagten, Hvis en af delene yderligere splittes, skal </w:t>
       </w:r>
       <w:r>
         <w:rPr>
-          <w:highlight w:val="yellow"/>
+          <w:highlight w:val="green"/>
         </w:rPr>
         <w:t>den originale igen ikke vises men kun de to dele, der kommer ud af splittet osv.</w:t>
       </w:r>

</xml_diff>